<commit_message>
Rewrite introduction in academic paper style
Replace the bulleted background/RQ/contributions subsections with flowing
paragraphs (motivation, related-work framing, gap statement, embedded
research questions) matching standard paper introduction structure, keeping
Contributions as a list and adding a Paper organization paragraph.

Co-Authored-By: Claude Sonnet 5 <noreply@anthropic.com>
</commit_message>
<xml_diff>
--- a/DataCo_QGNN_Detailed_Report.docx
+++ b/DataCo_QGNN_Detailed_Report.docx
@@ -51,11 +51,10 @@
     </w:p>
     <w:p>
       <w:pPr>
-        <w:pStyle w:val="Heading2"/>
-        <w:spacing w:after="150" w:before="300"/>
+        <w:spacing w:after="160"/>
       </w:pPr>
       <w:r>
-        <w:t xml:space="preserve">1.1 Background and motivation</w:t>
+        <w:t xml:space="preserve">Global e-commerce and logistics networks depend on the timely fulfillment of customer orders, yet late delivery remains one of the most common and costly failure modes in modern supply chains. Beyond its immediate cost — customer churn, return handling, and contractual penalties — a late delivery is frequently the first externally visible symptom of a deeper upstream disruption: supplier delay, warehouse congestion, or carrier capacity limits. Predicting late-delivery risk at order time, using only information available at that point, is therefore both a practically significant and a well-studied problem in the operations and machine learning literature.</w:t>
       </w:r>
     </w:p>
     <w:p>
@@ -63,7 +62,7 @@
         <w:spacing w:after="160"/>
       </w:pPr>
       <w:r>
-        <w:t xml:space="preserve">Late delivery is one of the most operationally and financially costly failure modes in e-commerce and logistics supply chains: it drives customer churn, return costs, and contractual penalties, and is frequently the first visible symptom of deeper upstream disruption (supplier delay, warehouse congestion, carrier capacity limits). Predicting late-delivery risk before it materializes — at order time, using only information available at that point — is therefore a practically important and well-studied task.</w:t>
+        <w:t xml:space="preserve">Machine learning approaches to this problem have evolved from tabular classifiers operating on order- and customer-level features, through graph neural networks (GNNs) that exploit the relational structure connecting orders, customers, products, and shipping destinations, to a more recent and less thoroughly evaluated direction: quantum machine learning. Variational quantum circuits, and specifically quantum graph neural networks (QGNNs) that pair a classical or quantum graph encoder with a parameterized quantum circuit, have been proposed as a candidate for extracting predictive structure beyond the reach of purely classical models, motivated by broader interest in near-term (NISQ-era) quantum algorithms for structured prediction tasks. Whether this promise holds for a concrete, real-world supply-chain task, however, has not been established with the same rigor typically expected of a classical benchmark.</w:t>
       </w:r>
     </w:p>
     <w:p>
@@ -71,7 +70,15 @@
         <w:spacing w:after="160"/>
       </w:pPr>
       <w:r>
-        <w:t xml:space="preserve">This work sits inside a larger M.Tech project comparing classical graph neural networks (GraphSAGE) against quantum graph neural networks (QGNN) for supply-chain risk prediction. The project's primary track uses a purpose-built synthetic dataset with full control over ground truth. This document covers the project's second, independent track: the same classical-vs-quantum comparison, run instead on a public, real-world dataset (DataCo Smart Supply Chain), to test whether conclusions drawn on synthetic data hold up against real transactional data with its own noise, class balance, and cold-start properties.</w:t>
+        <w:t xml:space="preserve">This gap has two distinct components, both addressed in this paper. First, published evaluations of classical and graph-based models on public supply-chain datasets are themselves inconsistent in quality: our review of the literature reporting results on the dataset used here (Section 3) surfaces papers with undisclosed splitting methodology, results that are outliers against every independent reproduction attempted, and — in one case — a direct, verifiable mismatch between a paper's claimed input features and the actual schema of the dataset it cites. Second, and discovered only during the course of this investigation, a substantial fraction of training runs for both the classical GNN and the QGNN collapse into a degenerate, near-constant predictor unless this failure mode is explicitly anticipated, detected, and corrected — a fact that, left undiagnosed, would silently bias any single-run comparison between the two model families in either direction.</w:t>
+      </w:r>
+    </w:p>
+    <w:p>
+      <w:pPr>
+        <w:spacing w:after="160"/>
+      </w:pPr>
+      <w:r>
+        <w:t xml:space="preserve">Motivated by these gaps, this paper presents a reproducible, multi-seed comparison of classical machine learning, a classical graph neural network (GraphSAGE), and a quantum graph neural network (QGNN) for late-delivery-risk prediction on the publicly available DataCo Smart Supply Chain dataset. The study is structured around three questions of performance and one of methodology: (i) does representing the problem as a heterogeneous graph of orders, customers, products, and shipping destinations, combined with graph-based message passing, improve prediction over flat tabular classical baselines; (ii) does replacing the classical graph encoder with a variational quantum circuit improve on classical GraphSAGE, and if so, under which architectural configuration — qubit count, circuit depth, encoding scheme, or choice of input representation; (iii) how do previously published results on this exact dataset compare, and how credible are they under independent, schema-level scrutiny; and (iv) is a conventional single-run comparison between these model families trustworthy at all, or does the training-instability failure mode identified in this work require multi-seed statistics and explicit diagnosis before any such comparison can be believed.</w:t>
       </w:r>
     </w:p>
     <w:p>
@@ -80,68 +87,7 @@
         <w:spacing w:after="150" w:before="300"/>
       </w:pPr>
       <w:r>
-        <w:t xml:space="preserve">1.2 Research questions</w:t>
-      </w:r>
-    </w:p>
-    <w:p>
-      <w:pPr>
-        <w:pStyle w:val="ListParagraph"/>
-        <w:numPr>
-          <w:ilvl w:val="0"/>
-          <w:numId w:val="2"/>
-        </w:numPr>
-        <w:spacing w:after="70"/>
-      </w:pPr>
-      <w:r>
-        <w:t xml:space="preserve">RQ1: Does representing the problem as a graph (customers, products, shipping regions, and the orders connecting them) and using a graph neural network (GraphSAGE) improve prediction over flat tabular classical models (Logistic Regression, Random Forest)?</w:t>
-      </w:r>
-    </w:p>
-    <w:p>
-      <w:pPr>
-        <w:pStyle w:val="ListParagraph"/>
-        <w:numPr>
-          <w:ilvl w:val="0"/>
-          <w:numId w:val="2"/>
-        </w:numPr>
-        <w:spacing w:after="70"/>
-      </w:pPr>
-      <w:r>
-        <w:t xml:space="preserve">RQ2: Does a quantum graph neural network (QGNN) improve on classical GraphSAGE, and if so, under which architectural choices (qubit count, circuit depth, data encoding, input source)?</w:t>
-      </w:r>
-    </w:p>
-    <w:p>
-      <w:pPr>
-        <w:pStyle w:val="ListParagraph"/>
-        <w:numPr>
-          <w:ilvl w:val="0"/>
-          <w:numId w:val="2"/>
-        </w:numPr>
-        <w:spacing w:after="70"/>
-      </w:pPr>
-      <w:r>
-        <w:t xml:space="preserve">RQ3: What do published results on this exact dataset report, and how credible are they under independent scrutiny?</w:t>
-      </w:r>
-    </w:p>
-    <w:p>
-      <w:pPr>
-        <w:pStyle w:val="ListParagraph"/>
-        <w:numPr>
-          <w:ilvl w:val="0"/>
-          <w:numId w:val="2"/>
-        </w:numPr>
-        <w:spacing w:after="70"/>
-      </w:pPr>
-      <w:r>
-        <w:t xml:space="preserve">RQ4 (emergent, discovered during the investigation): is a raw single-run comparison of these models trustworthy at all, or does training instability (mode collapse) require multi-seed statistics and explicit diagnosis before any comparison can be believed?</w:t>
-      </w:r>
-    </w:p>
-    <w:p>
-      <w:pPr>
-        <w:pStyle w:val="Heading2"/>
-        <w:spacing w:after="150" w:before="300"/>
-      </w:pPr>
-      <w:r>
-        <w:t xml:space="preserve">1.3 Contributions</w:t>
+        <w:t xml:space="preserve">Contributions</w:t>
       </w:r>
     </w:p>
     <w:p>
@@ -228,7 +174,7 @@
         <w:spacing w:after="150" w:before="300"/>
       </w:pPr>
       <w:r>
-        <w:t xml:space="preserve">1.4 Document structure</w:t>
+        <w:t xml:space="preserve">Paper organization</w:t>
       </w:r>
     </w:p>
     <w:p>

</xml_diff>